<commit_message>
accuracy general: 68.04 - total muestras: 7,178
</commit_message>
<xml_diff>
--- a/outputs/Guia_Explicativa_Completa_Proyecto_Emociones_CNN.docx
+++ b/outputs/Guia_Explicativa_Completa_Proyecto_Emociones_CNN.docx
@@ -294,7 +294,7 @@
           <w:color w:val="282828"/>
           <w:sz w:val="22"/>
         </w:rPr>
-        <w:t>Este proyecto implementa un sistema inteligente de visión artificial capaz de clasificar 7 emociones humanas (Enojado, Disgusto, Miedo, Feliz, Triste, Sorprendido y Neutral) en imágenes estáticas y video en tiempo real. La versión v2.0 resuelve los 4 desafíos críticos de los sistemas tradicionales:</w:t>
+        <w:t>Este proyecto implementa un sistema inteligente de visión artificial capaz de clasificar 7 emociones humanas (Enojado, Disgusto, Miedo, Feliz, Triste, Sorprendido y Neutral) en imágenes estáticas y video en tiempo real. La versión v2.0 resuelve los desafíos críticos de los sistemas tradicionales mediante innovaciones clave:</w:t>
       </w:r>
     </w:p>
     <w:p>
@@ -309,7 +309,7 @@
           <w:color w:val="003366"/>
           <w:sz w:val="21"/>
         </w:rPr>
-        <w:t xml:space="preserve">1. Pérdida de rostro al voltear la cabeza: </w:t>
+        <w:t xml:space="preserve">1. Detección Facial Neuronal Multi-Ángulo: </w:t>
       </w:r>
       <w:r>
         <w:rPr>
@@ -317,7 +317,7 @@
           <w:color w:val="282828"/>
           <w:sz w:val="21"/>
         </w:rPr>
-        <w:t>Reemplaza el clásico Haar Cascade por YuNet ONNX, detectando rostros en perfiles de hasta ±90° de giro sin falsos positivos.</w:t>
+        <w:t>Utiliza YuNet ONNX, detectando rostros en perfiles de hasta ±90° de giro, roll y pitch, con 5 puntos faciales (landmarks) y sin falsos positivos en ropa o fondos.</w:t>
       </w:r>
     </w:p>
     <w:p>
@@ -332,7 +332,7 @@
           <w:color w:val="003366"/>
           <w:sz w:val="21"/>
         </w:rPr>
-        <w:t xml:space="preserve">2. Dificultad para clasificar emociones sutiles: </w:t>
+        <w:t xml:space="preserve">2. Clasificación de Expresiones Sutiles: </w:t>
       </w:r>
       <w:r>
         <w:rPr>
@@ -340,7 +340,7 @@
           <w:color w:val="282828"/>
           <w:sz w:val="21"/>
         </w:rPr>
-        <w:t>Introduce EmotionResNetSE con mecanismos de atención que aprenden a focalizar cejas, comisuras y ojos.</w:t>
+        <w:t>Introduce EmotionResNetSE con atención por canales (Squeeze-and-Excitation) para priorizar cejas, ojos y comisuras labiales.</w:t>
       </w:r>
     </w:p>
     <w:p>
@@ -355,7 +355,7 @@
           <w:color w:val="003366"/>
           <w:sz w:val="21"/>
         </w:rPr>
-        <w:t xml:space="preserve">3. Parpadeo en tiempo real (Jitter): </w:t>
+        <w:t xml:space="preserve">3. Manejo del Desbalance Severo: </w:t>
       </w:r>
       <w:r>
         <w:rPr>
@@ -363,7 +363,7 @@
           <w:color w:val="282828"/>
           <w:sz w:val="21"/>
         </w:rPr>
-        <w:t>Aplica Suavizado Temporal EMA (Exponential Moving Average) para generar transiciones de probabilidad suaves y estables.</w:t>
+        <w:t>Combina Focal Loss (gamma=2.0) con Oversampling estocástico, elevando el Recall en clases raras como 'Disgusto' a más del 72.9%.</w:t>
       </w:r>
     </w:p>
     <w:p>
@@ -378,7 +378,7 @@
           <w:color w:val="003366"/>
           <w:sz w:val="21"/>
         </w:rPr>
-        <w:t xml:space="preserve">4. Dependencia de GPUs y librerías pesadas: </w:t>
+        <w:t xml:space="preserve">4. Inferencia Fluida sin Parpadeos (Jitter): </w:t>
       </w:r>
       <w:r>
         <w:rPr>
@@ -386,7 +386,30 @@
           <w:color w:val="282828"/>
           <w:sz w:val="21"/>
         </w:rPr>
-        <w:t>Exporta el modelo a ONNX y compila un paquete portátil autónomo (.ZIP) que corre en cualquier PC con puro OpenCV.</w:t>
+        <w:t>Aplica Suavizado Temporal EMA (Exponential Moving Average) para generar transiciones de probabilidad suaves y estables en tiempo real.</w:t>
+      </w:r>
+    </w:p>
+    <w:p>
+      <w:pPr>
+        <w:pStyle w:val="ListBullet"/>
+        <w:spacing w:after="60" w:line="276" w:lineRule="auto"/>
+      </w:pPr>
+      <w:r>
+        <w:rPr>
+          <w:rFonts w:ascii="Calibri" w:hAnsi="Calibri"/>
+          <w:b/>
+          <w:color w:val="003366"/>
+          <w:sz w:val="21"/>
+        </w:rPr>
+        <w:t xml:space="preserve">5. Despliegue Universal Portátil: </w:t>
+      </w:r>
+      <w:r>
+        <w:rPr>
+          <w:rFonts w:ascii="Calibri" w:hAnsi="Calibri"/>
+          <w:color w:val="282828"/>
+          <w:sz w:val="21"/>
+        </w:rPr>
+        <w:t>Exporta el modelo a ONNX y compila un paquete portátil autónomo (.ZIP) que corre en cualquier PC con puro OpenCV y NumPy a 60 FPS.</w:t>
       </w:r>
     </w:p>
     <w:tbl>
@@ -432,7 +455,7 @@
                 <w:color w:val="1E1E1E"/>
                 <w:sz w:val="20"/>
               </w:rPr>
-              <w:t>No fue necesario tomar más fotos manualmente. Mediante Data Augmentation acelerado en GPU (RandomErasing, RandomCrop y Flips), la red visualiza más de 1.5 millones de variantes en memoria a lo largo del entrenamiento, generalizando de forma robusta.</w:t>
+              <w:t>Mediante Data Augmentation acelerado en GPU (Rotación Afín ±12°, Random Crop con padding reflejado, Flips y Cutout) y regularización Mixup (alpha=0.1), la red visualiza millones de variantes únicas en memoria a lo largo del entrenamiento, generalizando de forma altamente robusta.</w:t>
             </w:r>
           </w:p>
         </w:tc>
@@ -646,7 +669,7 @@
                 <w:color w:val="282828"/>
                 <w:sz w:val="19"/>
               </w:rPr>
-              <w:t>Conv2D(1→64, 3x3) + BatchNorm + ReLU</w:t>
+              <w:t>Conv2D(1-&gt;64, 3x3) + BatchNorm + ReLU</w:t>
             </w:r>
           </w:p>
         </w:tc>
@@ -752,7 +775,7 @@
                 <w:color w:val="282828"/>
                 <w:sz w:val="19"/>
               </w:rPr>
-              <w:t>2x ResidualSEBlock(64→64) + SE-Attention</w:t>
+              <w:t>2x ResidualSEBlock(64-&gt;64) + SE-Attention</w:t>
             </w:r>
           </w:p>
         </w:tc>
@@ -858,7 +881,7 @@
                 <w:color w:val="282828"/>
                 <w:sz w:val="19"/>
               </w:rPr>
-              <w:t>2x ResidualSEBlock(64→128, stride=2) + SE-Attention</w:t>
+              <w:t>2x ResidualSEBlock(64-&gt;128, stride=2) + SE-Attention</w:t>
             </w:r>
           </w:p>
         </w:tc>
@@ -964,7 +987,7 @@
                 <w:color w:val="282828"/>
                 <w:sz w:val="19"/>
               </w:rPr>
-              <w:t>2x ResidualSEBlock(128→256, stride=2) + SE-Attention</w:t>
+              <w:t>2x ResidualSEBlock(128-&gt;256, stride=2) + SE-Attention</w:t>
             </w:r>
           </w:p>
         </w:tc>
@@ -1070,7 +1093,7 @@
                 <w:color w:val="282828"/>
                 <w:sz w:val="19"/>
               </w:rPr>
-              <w:t>2x ResidualSEBlock(256→512, stride=2) + SE-Attention</w:t>
+              <w:t>2x ResidualSEBlock(256-&gt;512, stride=2) + SE-Attention</w:t>
             </w:r>
           </w:p>
         </w:tc>
@@ -1282,7 +1305,7 @@
                 <w:color w:val="282828"/>
                 <w:sz w:val="19"/>
               </w:rPr>
-              <w:t>Dropout(0.4) + Linear(512→256) + BN1D + ReLU + Dropout(0.3) + Linear(256→7)</w:t>
+              <w:t>Dropout(0.4) + Linear(512-&gt;256) + BN1D + ReLU + Dropout(0.3) + Linear(256-&gt;7)</w:t>
             </w:r>
           </w:p>
         </w:tc>
@@ -1389,7 +1412,7 @@
           <w:color w:val="003366"/>
           <w:sz w:val="32"/>
         </w:rPr>
-        <w:t>3. Procesamiento y Carga Directa en VRAM (GPU Native)</w:t>
+        <w:t>3. Procesamiento en VRAM, Focal Loss y Balanceo</w:t>
       </w:r>
     </w:p>
     <w:p>
@@ -1406,7 +1429,7 @@
           <w:color w:val="282828"/>
           <w:sz w:val="22"/>
         </w:rPr>
-        <w:t>Aprovechando los 16 GB de VRAM de la NVIDIA GeForce RTX 5060 Ti, el dataset completo (35,887 imágenes) se almacena como tensores uint8 en la memoria de la tarjeta gráfica (78.9 MB totales):</w:t>
+        <w:t>El sistema aprovecha al máximo la tarjeta gráfica NVIDIA GeForce RTX 5060 Ti mediante tres pilares:</w:t>
       </w:r>
     </w:p>
     <w:p>
@@ -1421,7 +1444,7 @@
           <w:color w:val="003366"/>
           <w:sz w:val="21"/>
         </w:rPr>
-        <w:t xml:space="preserve">0% Uso de RAM del Sistema: </w:t>
+        <w:t xml:space="preserve">Dataset 100% Residente en VRAM: </w:t>
       </w:r>
       <w:r>
         <w:rPr>
@@ -1429,7 +1452,7 @@
           <w:color w:val="282828"/>
           <w:sz w:val="21"/>
         </w:rPr>
-        <w:t>La memoria RAM de la computadora queda completamente libre para otras tareas.</w:t>
+        <w:t>Las 35,887 imágenes se transfieren como tensores uint8 a la memoria GPU (78.9 MB totales), eliminando latencias del bus PCIe y permitiendo más de 12,000 imgs/seg.</w:t>
       </w:r>
     </w:p>
     <w:p>
@@ -1444,7 +1467,7 @@
           <w:color w:val="003366"/>
           <w:sz w:val="21"/>
         </w:rPr>
-        <w:t xml:space="preserve">Cero latencia PCIe: </w:t>
+        <w:t xml:space="preserve">Focal Loss (gamma=2.0): </w:t>
       </w:r>
       <w:r>
         <w:rPr>
@@ -1452,7 +1475,7 @@
           <w:color w:val="282828"/>
           <w:sz w:val="21"/>
         </w:rPr>
-        <w:t>Se eliminan las transferencias lentas bus a bus en cada época.</w:t>
+        <w:t>Modula la función de pérdida para concentrar el gradiente en las emociones difíciles y suprimir la sobreconfianza en las fáciles, resolviendo el ratio 17:1 entre Feliz y Disgusto.</w:t>
       </w:r>
     </w:p>
     <w:p>
@@ -1467,7 +1490,7 @@
           <w:color w:val="003366"/>
           <w:sz w:val="21"/>
         </w:rPr>
-        <w:t xml:space="preserve">Data Augmentation en CUDA: </w:t>
+        <w:t xml:space="preserve">Planificador SequentialLR: </w:t>
       </w:r>
       <w:r>
         <w:rPr>
@@ -1475,30 +1498,7 @@
           <w:color w:val="282828"/>
           <w:sz w:val="21"/>
         </w:rPr>
-        <w:t>Las operaciones de RandomCrop, Flips y Cutout se ejecutan en paralelo con núcleos CUDA a más de 12,000 imágenes por segundo.</w:t>
-      </w:r>
-    </w:p>
-    <w:p>
-      <w:pPr>
-        <w:pStyle w:val="ListBullet"/>
-        <w:spacing w:after="60" w:line="276" w:lineRule="auto"/>
-      </w:pPr>
-      <w:r>
-        <w:rPr>
-          <w:rFonts w:ascii="Calibri" w:hAnsi="Calibri"/>
-          <w:b/>
-          <w:color w:val="003366"/>
-          <w:sz w:val="21"/>
-        </w:rPr>
-        <w:t xml:space="preserve">Estabilidad en Windows: </w:t>
-      </w:r>
-      <w:r>
-        <w:rPr>
-          <w:rFonts w:ascii="Calibri" w:hAnsi="Calibri"/>
-          <w:color w:val="282828"/>
-          <w:sz w:val="21"/>
-        </w:rPr>
-        <w:t>Al no requerir subprocesos de CPU (num_workers=0), se eliminan los bloqueos de multiprocessing.</w:t>
+        <w:t>8 épocas de Linear Warmup para estabilizar pesos iniciales seguidas de decaimiento Cosine Annealing para alcanzar mínimos globales estables.</w:t>
       </w:r>
     </w:p>
     <w:p>
@@ -1513,7 +1513,7 @@
           <w:color w:val="003366"/>
           <w:sz w:val="32"/>
         </w:rPr>
-        <w:t>4. Resultados Experimentales en el Conjunto de TEST</w:t>
+        <w:t>4. Resultados Experimentales en el Conjunto de TEST (7,178 Muestras)</w:t>
       </w:r>
     </w:p>
     <w:p>
@@ -1530,7 +1530,7 @@
           <w:color w:val="282828"/>
           <w:sz w:val="22"/>
         </w:rPr>
-        <w:t>El modelo entrenado (guardado en su punto óptimo en la Época 40 con 68.97% Val Acc) fue evaluado formalmente sobre las 7,178 imágenes independientes del conjunto de Test, obteniendo un Accuracy Global de 67.86%:</w:t>
+        <w:t>El modelo final fue evaluado formalmente sobre las 7,178 imágenes independientes del conjunto de Test, obteniendo un Accuracy Global de 68.04% y superando el promedio de concordancia humana (65%-68%):</w:t>
       </w:r>
     </w:p>
     <w:tbl>
@@ -1732,7 +1732,7 @@
                 <w:color w:val="282828"/>
                 <w:sz w:val="19"/>
               </w:rPr>
-              <w:t>62.12%</w:t>
+              <w:t>61.71%</w:t>
             </w:r>
           </w:p>
         </w:tc>
@@ -1758,7 +1758,7 @@
                 <w:color w:val="282828"/>
                 <w:sz w:val="19"/>
               </w:rPr>
-              <w:t>59.92%</w:t>
+              <w:t>59.39%</w:t>
             </w:r>
           </w:p>
         </w:tc>
@@ -1784,7 +1784,7 @@
                 <w:color w:val="282828"/>
                 <w:sz w:val="19"/>
               </w:rPr>
-              <w:t>61.00%</w:t>
+              <w:t>60.53%</w:t>
             </w:r>
           </w:p>
         </w:tc>
@@ -1864,7 +1864,7 @@
                 <w:color w:val="282828"/>
                 <w:sz w:val="19"/>
               </w:rPr>
-              <w:t>58.14%</w:t>
+              <w:t>52.26%</w:t>
             </w:r>
           </w:p>
         </w:tc>
@@ -1890,7 +1890,7 @@
                 <w:color w:val="282828"/>
                 <w:sz w:val="19"/>
               </w:rPr>
-              <w:t>67.57%</w:t>
+              <w:t>72.97%</w:t>
             </w:r>
           </w:p>
         </w:tc>
@@ -1916,7 +1916,7 @@
                 <w:color w:val="282828"/>
                 <w:sz w:val="19"/>
               </w:rPr>
-              <w:t>62.50%</w:t>
+              <w:t>60.90%</w:t>
             </w:r>
           </w:p>
         </w:tc>
@@ -1996,7 +1996,7 @@
                 <w:color w:val="282828"/>
                 <w:sz w:val="19"/>
               </w:rPr>
-              <w:t>52.99%</w:t>
+              <w:t>55.43%</w:t>
             </w:r>
           </w:p>
         </w:tc>
@@ -2022,7 +2022,7 @@
                 <w:color w:val="282828"/>
                 <w:sz w:val="19"/>
               </w:rPr>
-              <w:t>48.54%</w:t>
+              <w:t>48.83%</w:t>
             </w:r>
           </w:p>
         </w:tc>
@@ -2048,7 +2048,7 @@
                 <w:color w:val="282828"/>
                 <w:sz w:val="19"/>
               </w:rPr>
-              <w:t>50.66%</w:t>
+              <w:t>51.92%</w:t>
             </w:r>
           </w:p>
         </w:tc>
@@ -2128,7 +2128,7 @@
                 <w:color w:val="282828"/>
                 <w:sz w:val="19"/>
               </w:rPr>
-              <w:t>86.77%</w:t>
+              <w:t>88.47%</w:t>
             </w:r>
           </w:p>
         </w:tc>
@@ -2154,7 +2154,7 @@
                 <w:color w:val="282828"/>
                 <w:sz w:val="19"/>
               </w:rPr>
-              <w:t>86.87%</w:t>
+              <w:t>86.47%</w:t>
             </w:r>
           </w:p>
         </w:tc>
@@ -2180,7 +2180,7 @@
                 <w:color w:val="282828"/>
                 <w:sz w:val="19"/>
               </w:rPr>
-              <w:t>86.82%</w:t>
+              <w:t>87.46%</w:t>
             </w:r>
           </w:p>
         </w:tc>
@@ -2260,7 +2260,7 @@
                 <w:color w:val="282828"/>
                 <w:sz w:val="19"/>
               </w:rPr>
-              <w:t>56.94%</w:t>
+              <w:t>55.93%</w:t>
             </w:r>
           </w:p>
         </w:tc>
@@ -2286,7 +2286,7 @@
                 <w:color w:val="282828"/>
                 <w:sz w:val="19"/>
               </w:rPr>
-              <w:t>54.29%</w:t>
+              <w:t>55.17%</w:t>
             </w:r>
           </w:p>
         </w:tc>
@@ -2312,7 +2312,7 @@
                 <w:color w:val="282828"/>
                 <w:sz w:val="19"/>
               </w:rPr>
-              <w:t>55.58%</w:t>
+              <w:t>55.55%</w:t>
             </w:r>
           </w:p>
         </w:tc>
@@ -2392,7 +2392,7 @@
                 <w:color w:val="282828"/>
                 <w:sz w:val="19"/>
               </w:rPr>
-              <w:t>78.50%</w:t>
+              <w:t>71.99%</w:t>
             </w:r>
           </w:p>
         </w:tc>
@@ -2418,7 +2418,7 @@
                 <w:color w:val="282828"/>
                 <w:sz w:val="19"/>
               </w:rPr>
-              <w:t>80.39%</w:t>
+              <w:t>83.51%</w:t>
             </w:r>
           </w:p>
         </w:tc>
@@ -2444,7 +2444,7 @@
                 <w:color w:val="282828"/>
                 <w:sz w:val="19"/>
               </w:rPr>
-              <w:t>79.43%</w:t>
+              <w:t>77.33%</w:t>
             </w:r>
           </w:p>
         </w:tc>
@@ -2524,7 +2524,7 @@
                 <w:color w:val="282828"/>
                 <w:sz w:val="19"/>
               </w:rPr>
-              <w:t>61.20%</w:t>
+              <w:t>64.36%</w:t>
             </w:r>
           </w:p>
         </w:tc>
@@ -2550,7 +2550,7 @@
                 <w:color w:val="282828"/>
                 <w:sz w:val="19"/>
               </w:rPr>
-              <w:t>68.05%</w:t>
+              <w:t>66.34%</w:t>
             </w:r>
           </w:p>
         </w:tc>
@@ -2576,7 +2576,7 @@
                 <w:color w:val="282828"/>
                 <w:sz w:val="19"/>
               </w:rPr>
-              <w:t>64.44%</w:t>
+              <w:t>65.34%</w:t>
             </w:r>
           </w:p>
         </w:tc>
@@ -2656,7 +2656,7 @@
                 <w:color w:val="282828"/>
                 <w:sz w:val="19"/>
               </w:rPr>
-              <w:t>67.68%</w:t>
+              <w:t>67.92%</w:t>
             </w:r>
           </w:p>
         </w:tc>
@@ -2682,7 +2682,7 @@
                 <w:color w:val="282828"/>
                 <w:sz w:val="19"/>
               </w:rPr>
-              <w:t>67.86%</w:t>
+              <w:t>68.04%</w:t>
             </w:r>
           </w:p>
         </w:tc>
@@ -2708,7 +2708,7 @@
                 <w:color w:val="282828"/>
                 <w:sz w:val="19"/>
               </w:rPr>
-              <w:t>67.71%</w:t>
+              <w:t>67.87%</w:t>
             </w:r>
           </w:p>
         </w:tc>
@@ -2757,7 +2757,7 @@
           <w:color w:val="003366"/>
           <w:sz w:val="32"/>
         </w:rPr>
-        <w:t>5. Sistema en Tiempo Real: YuNet y Suavizado Temporal EMA</w:t>
+        <w:t>5. Sistema en Tiempo Real: YuNet, EMA Tracker y 60 FPS</w:t>
       </w:r>
     </w:p>
     <w:p>
@@ -2774,7 +2774,7 @@
           <w:color w:val="282828"/>
           <w:sz w:val="22"/>
         </w:rPr>
-        <w:t>El módulo src/realtime.py ofrece una experiencia de producción mediante dos mecanismos clave:</w:t>
+        <w:t>El módulo src/realtime.py ofrece una experiencia de producción optimizada:</w:t>
       </w:r>
     </w:p>
     <w:p>
@@ -2820,7 +2820,7 @@
           <w:color w:val="282828"/>
           <w:sz w:val="21"/>
         </w:rPr>
-        <w:t>Fórmula exponencial P_t = 0.30 * P_actual + 0.70 * P_anterior. Evita que un pestañeo o ruido en un fotograma cambie erráticamente la emoción predicha.</w:t>
+        <w:t>Fórmula exponencial P_t = 0.30 * P_actual + 0.70 * P_anterior. Evita parpadeos bruscos por microexpresiones.</w:t>
       </w:r>
     </w:p>
     <w:p>
@@ -2835,7 +2835,7 @@
           <w:color w:val="003366"/>
           <w:sz w:val="21"/>
         </w:rPr>
-        <w:t xml:space="preserve">Controles Interactivos en Caliente: </w:t>
+        <w:t xml:space="preserve">Preprocesamiento C++ Ultrarrápido: </w:t>
       </w:r>
       <w:r>
         <w:rPr>
@@ -2843,7 +2843,53 @@
           <w:color w:val="282828"/>
           <w:sz w:val="21"/>
         </w:rPr>
-        <w:t>'d' para alternar YuNet/Haar, 't' para toggle de suavizado EMA, 'l' para landmarks, 's' para screenshot HD y 'q' para salir.</w:t>
+        <w:t>Redimensiona el recorte del rostro en C++ directamente a tensores en &lt;0.05 ms.</w:t>
+      </w:r>
+    </w:p>
+    <w:p>
+      <w:pPr>
+        <w:pStyle w:val="ListBullet"/>
+        <w:spacing w:after="60" w:line="276" w:lineRule="auto"/>
+      </w:pPr>
+      <w:r>
+        <w:rPr>
+          <w:rFonts w:ascii="Calibri" w:hAnsi="Calibri"/>
+          <w:b/>
+          <w:color w:val="003366"/>
+          <w:sz w:val="21"/>
+        </w:rPr>
+        <w:t xml:space="preserve">Optimización de Hardware MJPG: </w:t>
+      </w:r>
+      <w:r>
+        <w:rPr>
+          <w:rFonts w:ascii="Calibri" w:hAnsi="Calibri"/>
+          <w:color w:val="282828"/>
+          <w:sz w:val="21"/>
+        </w:rPr>
+        <w:t>Configura la cámara web a 60 FPS y buffersize=1, eliminando retrasos por cola de fotogramas.</w:t>
+      </w:r>
+    </w:p>
+    <w:p>
+      <w:pPr>
+        <w:pStyle w:val="ListBullet"/>
+        <w:spacing w:after="60" w:line="276" w:lineRule="auto"/>
+      </w:pPr>
+      <w:r>
+        <w:rPr>
+          <w:rFonts w:ascii="Calibri" w:hAnsi="Calibri"/>
+          <w:b/>
+          <w:color w:val="003366"/>
+          <w:sz w:val="21"/>
+        </w:rPr>
+        <w:t xml:space="preserve">Ventana Dinámica Ajustable: </w:t>
+      </w:r>
+      <w:r>
+        <w:rPr>
+          <w:rFonts w:ascii="Calibri" w:hAnsi="Calibri"/>
+          <w:color w:val="282828"/>
+          <w:sz w:val="21"/>
+        </w:rPr>
+        <w:t>Ventana libremente redimensionable mediante mouse o maximizado con cv2.WINDOW_NORMAL.</w:t>
       </w:r>
     </w:p>
     <w:p>
@@ -2858,7 +2904,7 @@
           <w:color w:val="003366"/>
           <w:sz w:val="32"/>
         </w:rPr>
-        <w:t>6. Exportación Portátil Universal (Opción 6 del Menú)</w:t>
+        <w:t>6. Exportación Portátil Universal (Opción 5 del Menú)</w:t>
       </w:r>
     </w:p>
     <w:p>
@@ -2875,7 +2921,7 @@
           <w:color w:val="282828"/>
           <w:sz w:val="22"/>
         </w:rPr>
-        <w:t>Para compartir el proyecto y que cualquier persona o jurado pueda probarlo en su propia computadora sin necesidad de instalar PyTorch ni contar con tarjeta gráfica dedicada, se diseñó la Opción 6 del menú:</w:t>
+        <w:t>Para compartir el proyecto y que cualquier persona o jurado pueda probarlo en su propia computadora sin necesidad de instalar PyTorch ni contar con tarjeta gráfica dedicada, se diseñó la Opción 5 del menú:</w:t>
       </w:r>
     </w:p>
     <w:p>
@@ -2944,7 +2990,7 @@
           <w:color w:val="282828"/>
           <w:sz w:val="21"/>
         </w:rPr>
-        <w:t>Únicamente Python con OpenCV y NumPy (se autoinstalan en 5 segundos). No requiere los 3 GB de PyTorch CUDA.</w:t>
+        <w:t>Únicamente Python con OpenCV y NumPy (se autoinstalan en segundos). No requiere los 3 GB de PyTorch CUDA.</w:t>
       </w:r>
     </w:p>
     <w:p>
@@ -2997,7 +3043,7 @@
           <w:color w:val="003366"/>
           <w:sz w:val="21"/>
         </w:rPr>
-        <w:t xml:space="preserve">P: ¿Por qué el modelo alcanza 68.97% de Val Acc y 67.86% en Test?: </w:t>
+        <w:t xml:space="preserve">P: ¿Por qué el modelo alcanza 68.04% en Test y supera el benchmark humano?: </w:t>
       </w:r>
       <w:r>
         <w:rPr>
@@ -3006,7 +3052,7 @@
           <w:sz w:val="21"/>
         </w:rPr>
         <w:br/>
-        <w:t>R: Porque incorpora conexiones residuales (ResNet) para evitar el desvanecimiento de gradiente, módulos de atención SE para priorizar rasgos morfológicos clave, y pesos de clase (Class Weights) para equilibrar emociones difíciles.</w:t>
+        <w:t>R: Porque incorpora conexiones residuales (ResNet) para evitar el desvanecimiento de gradiente, módulos de atención SE para priorizar rasgos morfológicos clave, y Focal Loss con Oversampling para equilibrar emociones difíciles.</w:t>
       </w:r>
     </w:p>
     <w:p>
@@ -3030,7 +3076,7 @@
           <w:sz w:val="21"/>
         </w:rPr>
         <w:br/>
-        <w:t>R: Las 7,178 imágenes de Test se aislaron completamente y nunca se usaron en entrenamiento. El Data Augmentation solo se activa en el conjunto de entrenamiento (is_train=True), y los Class Weights se calcularon exclusivamente con las etiquetas de train.</w:t>
+        <w:t>R: Las 7,178 imágenes de Test se aislaron completamente y nunca se usaron en entrenamiento. El Data Augmentation y Oversampling solo se aplican sobre el conjunto de entrenamiento (is_train=True).</w:t>
       </w:r>
     </w:p>
     <w:p>
@@ -3045,7 +3091,7 @@
           <w:color w:val="003366"/>
           <w:sz w:val="21"/>
         </w:rPr>
-        <w:t xml:space="preserve">P: ¿Por qué se seleccionó el modelo de la Época 40 y no el de la 50?: </w:t>
+        <w:t xml:space="preserve">P: ¿Qué ventajas ofrece YuNet frente a clasificadores tradicionales?: </w:t>
       </w:r>
       <w:r>
         <w:rPr>
@@ -3054,31 +3100,7 @@
           <w:sz w:val="21"/>
         </w:rPr>
         <w:br/>
-        <w:t>R: Porque el sistema cuenta con Early Stopping y seguimiento de métricas. A partir de la época 40 comenzó un ligero sobreajuste en train (80.9%), por lo que el checkpoint guardó el punto de óptima generalización (Época 40, Val Acc 68.97%).</w:t>
-      </w:r>
-    </w:p>
-    <w:p>
-      <w:pPr>
-        <w:pStyle w:val="ListBullet"/>
-        <w:spacing w:after="60" w:line="276" w:lineRule="auto"/>
-      </w:pPr>
-      <w:r>
-        <w:rPr>
-          <w:rFonts w:ascii="Calibri" w:hAnsi="Calibri"/>
-          <w:b/>
-          <w:color w:val="003366"/>
-          <w:sz w:val="21"/>
-        </w:rPr>
-        <w:t xml:space="preserve">P: ¿Qué ventajas ofrece YuNet frente a Haar Cascade?: </w:t>
-      </w:r>
-      <w:r>
-        <w:rPr>
-          <w:rFonts w:ascii="Calibri" w:hAnsi="Calibri"/>
-          <w:color w:val="282828"/>
-          <w:sz w:val="21"/>
-        </w:rPr>
-        <w:br/>
-        <w:t>R: Haar Cascade solo detecta caras frontales y falla con giros &gt;15°. YuNet es una red neuronal convolucional liviana (ONNX) que detecta caras de perfil (yaw ±90°), cabeceo, inclinación y elimina falsos positivos en ropa/fondos mediante umbrales neuronales.</w:t>
+        <w:t>R: YuNet es una red convolucional profunda ligera (ONNX) que detecta caras de perfil (yaw ±90°), cabeceo e inclinación, extrae 5 puntos faciales y elimina falsos positivos en ropa y fondos.</w:t>
       </w:r>
     </w:p>
     <w:p>
@@ -3126,7 +3148,7 @@
           <w:sz w:val="21"/>
         </w:rPr>
         <w:br/>
-        <w:t>R: Se exportó el modelo PyTorch al estándar universal ONNX (Open Neural Network Exchange). Esto permite ejecutar la red mediante el motor OpenCV DNN nativo en CPU con solo 15 MB de librerías, empaquetado en un archivo .ZIP con un ejecutable .bat de 1 solo clic.</w:t>
+        <w:t>R: Se exportó el modelo PyTorch al estándar universal ONNX. Esto permite ejecutar la red mediante el motor OpenCV DNN nativo en CPU con solo 15 MB de librerías, empaquetado en un archivo .ZIP con un ejecutable .bat de 1 solo clic.</w:t>
       </w:r>
     </w:p>
     <w:sectPr>

</xml_diff>